<commit_message>
Update paper draft and add PDF
</commit_message>
<xml_diff>
--- a/paper/bandit_paper_equation_wordstyle_v1.docx
+++ b/paper/bandit_paper_equation_wordstyle_v1.docx
@@ -310,7 +310,7 @@
           <w:rFonts w:ascii="Arial Unicode MS" w:cs="Arial Unicode MS" w:eastAsia="Arial Unicode MS" w:hAnsi="Arial Unicode MS"/>
           <w:rtl w:val="0"/>
         </w:rPr>
-        <w:t xml:space="preserve">*****株式会社</w:t>
+        <w:t xml:space="preserve">AKKODiSコンサルティング株式会社</w:t>
       </w:r>
       <w:r>
         <w:rPr>
@@ -1689,6 +1689,22 @@
           <w:rtl w:val="0"/>
         </w:rPr>
         <w:t xml:space="preserve">　以下に，Random，Greedy，ε-Greedy の各方策，および評価指標として用いる regret と累積後悔，さらに価値推定の更新式を示す。</w:t>
+      </w:r>
+    </w:p>
+    <w:p>
+      <w:pPr>
+        <w:spacing w:after="30" w:lineRule="auto"/>
+        <w:jc w:val="both"/>
+        <w:rPr>
+          <w:rFonts w:ascii="Arial" w:cs="Arial" w:eastAsia="Arial" w:hAnsi="Arial"/>
+          <w:sz w:val="22"/>
+          <w:szCs w:val="22"/>
+        </w:rPr>
+      </w:pPr>
+      <w:r>
+        <w:rPr>
+          <w:rtl w:val="0"/>
+        </w:rPr>
       </w:r>
     </w:p>
     <w:p>

</xml_diff>